<commit_message>
Mention Defenssive's Microsoft Partner status in the credibility messages
Co-Authored-By: Claude Opus 5.5 <noreply@anthropic.com>
Claude-Session: https://claude.ai/code/session_01Lr1syY3hkLeZYJhtN2s4Rg
</commit_message>
<xml_diff>
--- a/Outreach Messages - Defenssive.docx
+++ b/Outreach Messages - Defenssive.docx
@@ -65,7 +65,7 @@
     <w:p>
       <w:r>
         <w:rPr/>
-        <w:t xml:space="preserve">Defenssive is a Microsoft security company based in Itasca, Illinois, in the Chicago area. It focuses only on Microsoft 365, Entra ID and Azure. The founder spent 8 years as a cybersecurity engineer before starting the company, and the team holds five Microsoft security certifications (SC-100, SC-200, SC-300, SC-401 and AZ-500).</w:t>
+        <w:t xml:space="preserve">Defenssive is a Microsoft Partner based in Itasca, Illinois, in the Chicago area. It focuses only on Microsoft 365, Entra ID and Azure. The founder spent 8 years as a cybersecurity engineer before starting the company, and the team holds five Microsoft security certifications (SC-100, SC-200, SC-300, SC-401 and AZ-500).</w:t>
       </w:r>
     </w:p>
     <w:p>
@@ -775,7 +775,7 @@
       </w:r>
       <w:r>
         <w:rPr/>
-        <w:t xml:space="preserve"> boost. Defenssive has no clients yet, so the credibility comes from the founder's engineering background, the team's Microsoft security certifications, and a product they can try on their own data.</w:t>
+        <w:t xml:space="preserve"> boost. Defenssive has no clients yet, so the credibility comes from being a Microsoft Partner, the founder's engineering background, the team's Microsoft security certifications, and a product they can try on their own data.</w:t>
       </w:r>
     </w:p>
     <w:p>
@@ -825,7 +825,7 @@
           <w:i w:val="1"/>
           <w:iCs w:val="1"/>
         </w:rPr>
-        <w:t xml:space="preserve">, I jumped into questions without properly introducing myself. I'm Camila from Defenssive, a Chicago-area company that focuses only on Microsoft 365 security. Our founder spent 8 years as a cybersecurity engineer, and our team holds five Microsoft security certifications. We built AI Security Manager. It connects to your Microsoft 365 and shows within minutes what's exposed and what to fix first, with a report you can use when a client asks. If interested, happy to tell you more.</w:t>
+        <w:t xml:space="preserve">, I jumped into questions without properly introducing myself. I'm Camila from Defenssive, a Chicago-area Microsoft Partner that focuses only on Microsoft 365 security. Our founder spent 8 years as a cybersecurity engineer, and our team holds five Microsoft security certifications. We built AI Security Manager. It connects to your Microsoft 365 and shows within minutes what's exposed and what to fix first, with a report you can use when a client asks. If interested, happy to tell you more.</w:t>
       </w:r>
     </w:p>
     <w:p>
@@ -875,7 +875,7 @@
           <w:i w:val="1"/>
           <w:iCs w:val="1"/>
         </w:rPr>
-        <w:t xml:space="preserve">, I jumped into questions without properly introducing myself. I'm Camila from Defenssive, a Chicago-area company that focuses only on Microsoft 365 security for smaller firms. Our founder spent 8 years as a cybersecurity engineer, and our team holds five Microsoft security certifications. We built AI Security Manager, which shows in plain language where your Microsoft 365 is exposed and what to fix first. If interested, happy to tell you more.</w:t>
+        <w:t xml:space="preserve">, I jumped into questions without properly introducing myself. I'm Camila from Defenssive, a Chicago-area Microsoft Partner that focuses only on Microsoft 365 security for smaller firms. Our founder spent 8 years as a cybersecurity engineer, and our team holds five Microsoft security certifications. We built AI Security Manager, which shows in plain language where your Microsoft 365 is exposed and what to fix first. If interested, happy to tell you more.</w:t>
       </w:r>
     </w:p>
     <w:p>
@@ -1388,7 +1388,7 @@
       </w:r>
       <w:r>
         <w:rPr/>
-        <w:t xml:space="preserve"> boost. Defenssive has no clients yet, so the credibility comes from the founder's engineering background, the team's Microsoft security certifications, and a product they can try on their own data.</w:t>
+        <w:t xml:space="preserve"> boost. Defenssive has no clients yet, so the credibility comes from being a Microsoft Partner, the founder's engineering background, the team's Microsoft security certifications, and a product they can try on their own data.</w:t>
       </w:r>
     </w:p>
     <w:p>
@@ -1437,7 +1437,7 @@
           <w:i w:val="1"/>
           <w:iCs w:val="1"/>
         </w:rPr>
-        <w:t xml:space="preserve">, I jumped into questions without properly introducing myself. I'm Camila from Defenssive, a Chicago-area company that focuses only on Microsoft 365 security for smaller businesses. Our founder spent 8 years as a cybersecurity engineer, and our team holds five Microsoft security certifications. We built AI Security Manager, which checks the email and sign-in settings attackers use to take over a mailbox, and shows in plain language what to fix first. If interested, happy to tell you more.</w:t>
+        <w:t xml:space="preserve">, I jumped into questions without properly introducing myself. I'm Camila from Defenssive, a Chicago-area Microsoft Partner that focuses only on Microsoft 365 security for smaller businesses. Our founder spent 8 years as a cybersecurity engineer, and our team holds five Microsoft security certifications. We built AI Security Manager, which checks the email and sign-in settings attackers use to take over a mailbox, and shows in plain language what to fix first. If interested, happy to tell you more.</w:t>
       </w:r>
     </w:p>
     <w:p>
@@ -2000,7 +2000,7 @@
       </w:r>
       <w:r>
         <w:rPr/>
-        <w:t xml:space="preserve"> boost. Defenssive has no clients yet, so the credibility comes from the founder's engineering background, the team's Microsoft security certifications, and a product they can try on their own data.</w:t>
+        <w:t xml:space="preserve"> boost. Defenssive has no clients yet, so the credibility comes from being a Microsoft Partner, the founder's engineering background, the team's Microsoft security certifications, and a product they can try on their own data.</w:t>
       </w:r>
     </w:p>
     <w:p>
@@ -2049,7 +2049,7 @@
           <w:i w:val="1"/>
           <w:iCs w:val="1"/>
         </w:rPr>
-        <w:t xml:space="preserve">, I jumped into questions without properly introducing myself. I'm Camila from Defenssive, a Chicago-area company that focuses only on Microsoft 365 security for smaller businesses. Our founder spent 8 years as a cybersecurity engineer, and our team holds five Microsoft security certifications. We built AI Security Manager, which checks your Microsoft 365 access settings and shows in plain language what to fix first. Our engineers can then help fix it. If interested, happy to tell you more.</w:t>
+        <w:t xml:space="preserve">, I jumped into questions without properly introducing myself. I'm Camila from Defenssive, a Chicago-area Microsoft Partner that focuses only on Microsoft 365 security for smaller businesses. Our founder spent 8 years as a cybersecurity engineer, and our team holds five Microsoft security certifications. We built AI Security Manager, which checks your Microsoft 365 access settings and shows in plain language what to fix first. Our engineers can then help fix it. If interested, happy to tell you more.</w:t>
       </w:r>
     </w:p>
     <w:p>
@@ -2333,7 +2333,7 @@
           <w:i w:val="1"/>
           <w:iCs w:val="1"/>
         </w:rPr>
-        <w:t xml:space="preserve">I'm Camila from Defenssive, a Chicago-area company that focuses only on Microsoft 365 security for smaller businesses.</w:t>
+        <w:t xml:space="preserve">I'm Camila from Defenssive, a Chicago-area Microsoft Partner that focuses only on Microsoft 365 security for smaller businesses.</w:t>
       </w:r>
     </w:p>
     <w:p>
@@ -2814,7 +2814,7 @@
           <w:i w:val="1"/>
           <w:iCs w:val="1"/>
         </w:rPr>
-        <w:t xml:space="preserve">I'm Camila from Defenssive, a Chicago-area company that focuses only on Microsoft 365 security for smaller businesses.</w:t>
+        <w:t xml:space="preserve">I'm Camila from Defenssive, a Chicago-area Microsoft Partner that focuses only on Microsoft 365 security for smaller businesses.</w:t>
       </w:r>
     </w:p>
     <w:p>
@@ -3295,7 +3295,7 @@
           <w:i w:val="1"/>
           <w:iCs w:val="1"/>
         </w:rPr>
-        <w:t xml:space="preserve">I'm Camila from Defenssive, a Chicago-area company that focuses only on Microsoft 365 security for smaller businesses.</w:t>
+        <w:t xml:space="preserve">I'm Camila from Defenssive, a Chicago-area Microsoft Partner that focuses only on Microsoft 365 security for smaller businesses.</w:t>
       </w:r>
     </w:p>
     <w:p>
@@ -3703,7 +3703,7 @@
       </w:r>
       <w:r>
         <w:rPr/>
-        <w:t xml:space="preserve"> Defenssive has no clients or testimonials, so no message mentions results or client names. The credibility comes from the founder's 8 years as a cybersecurity engineer, the five Microsoft certifications, and a free trial on their own data. Once the first trial users agree, two or three short quotes would make the credibility message much stronger.</w:t>
+        <w:t xml:space="preserve"> Defenssive has no clients or testimonials, so no message mentions results or client names. The credibility comes from being a Microsoft Partner (shown on defenssive.com), the founder's 8 years as a cybersecurity engineer, the five Microsoft certifications, and a free trial on their own data. Once the first trial users agree, two or three short quotes would make the credibility message much stronger.</w:t>
       </w:r>
     </w:p>
     <w:p>

</xml_diff>

<commit_message>
Align Defenssive messages with the ICP research
Remove claims the research doesn't support, add the Managing Partner, real
estate and Microsoft MFA angles from the research, and tidy wording.

Co-Authored-By: Claude Opus 5.5 <noreply@anthropic.com>
Claude-Session: https://claude.ai/code/session_01Lr1syY3hkLeZYJhtN2s4Rg
</commit_message>
<xml_diff>
--- a/Outreach Messages - Defenssive.docx
+++ b/Outreach Messages - Defenssive.docx
@@ -523,7 +523,7 @@
           <w:i w:val="1"/>
           <w:iCs w:val="1"/>
         </w:rPr>
-        <w:t xml:space="preserve">. Curious what you think. I've been talking to a few people who run IT at law firms, and opinions seem split. Some say Microsoft 365 is secure enough once MFA is turned on. Others say the default settings leave too much open, especially file sharing, and need a proper review. Where do you land?</w:t>
+        <w:t xml:space="preserve">. Curious what you think. I keep seeing two views among people who run IT at law firms. Some say Microsoft 365 is secure enough once MFA is turned on. Others say the default settings leave too much open, especially file sharing, and need a proper review. Where do you land?</w:t>
       </w:r>
     </w:p>
     <w:p>
@@ -573,7 +573,7 @@
           <w:i w:val="1"/>
           <w:iCs w:val="1"/>
         </w:rPr>
-        <w:t xml:space="preserve">. Curious what you think. I've been talking to a few law firms, and opinions seem split. Some say security is IT's job and partners shouldn't have to think about it. Others say it's become a leadership question, now that clients ask firms to prove how they protect their data. Where do you land?</w:t>
+        <w:t xml:space="preserve">. Curious what you think. I keep seeing two views at law firms. Some say security is IT's job and partners shouldn't have to think about it. Others say it's become a leadership question, now that clients ask firms to prove how they protect their data. Where do you land?</w:t>
       </w:r>
     </w:p>
     <w:p>
@@ -674,7 +674,7 @@
           <w:i w:val="1"/>
           <w:iCs w:val="1"/>
         </w:rPr>
-        <w:t xml:space="preserve">. More clients are asking law firms to show how they protect their data. At firms of 10 to 49 lawyers, 41% of lawyers say a client has already asked. It usually lands on IT, often as a questionnaire with a short deadline. Has a client asked you for that yet?</w:t>
+        <w:t xml:space="preserve">. More clients are asking law firms to show how they protect their data. At firms of 10 to 49 lawyers, 41% of lawyers say a client has already asked. It usually lands on IT, often as a security questionnaire. Has a client asked you for that yet?</w:t>
       </w:r>
     </w:p>
     <w:p>
@@ -690,6 +690,106 @@
           <w:color w:val="1F497D"/>
         </w:rPr>
         <w:t xml:space="preserve">Leadership track</w:t>
+      </w:r>
+    </w:p>
+    <w:p>
+      <w:pPr>
+        <w:pBdr>
+          <w:top w:color="4f81bd" w:space="10" w:sz="4" w:val="single"/>
+          <w:bottom w:color="4f81bd" w:space="10" w:sz="4" w:val="single"/>
+        </w:pBdr>
+        <w:spacing w:after="240" w:before="240" w:line="240" w:lineRule="auto"/>
+        <w:ind w:left="720"/>
+        <w:jc w:val="left"/>
+      </w:pPr>
+      <w:r>
+        <w:rPr>
+          <w:i w:val="1"/>
+          <w:iCs w:val="1"/>
+        </w:rPr>
+        <w:t xml:space="preserve">I had a thought, </w:t>
+      </w:r>
+      <w:r>
+        <w:rPr>
+          <w:b w:val="1"/>
+          <w:bCs w:val="1"/>
+          <w:i w:val="1"/>
+          <w:iCs w:val="1"/>
+          <w:color w:val="FF9900"/>
+        </w:rPr>
+        <w:t xml:space="preserve">[First Name]</w:t>
+      </w:r>
+      <w:r>
+        <w:rPr>
+          <w:i w:val="1"/>
+          <w:iCs w:val="1"/>
+        </w:rPr>
+        <w:t xml:space="preserve">. The ABA expects lawyers to make reasonable efforts to protect client information, including in email and the cloud. Yet 29% of lawyers say their firm has had a security breach, and only about a third of firms have a plan for when it happens. How does your firm approach it?</w:t>
+      </w:r>
+    </w:p>
+    <w:p>
+      <w:pPr>
+        <w:spacing w:before="240" w:after="0"/>
+      </w:pPr>
+      <w:r>
+        <w:rPr>
+          <w:b w:val="1"/>
+          <w:bCs w:val="1"/>
+          <w:i w:val="1"/>
+          <w:iCs w:val="1"/>
+          <w:color w:val="1F497D"/>
+        </w:rPr>
+        <w:t xml:space="preserve">Real estate practices (either track)</w:t>
+      </w:r>
+    </w:p>
+    <w:p>
+      <w:pPr>
+        <w:pBdr>
+          <w:top w:color="4f81bd" w:space="10" w:sz="4" w:val="single"/>
+          <w:bottom w:color="4f81bd" w:space="10" w:sz="4" w:val="single"/>
+        </w:pBdr>
+        <w:spacing w:after="240" w:before="240" w:line="240" w:lineRule="auto"/>
+        <w:ind w:left="720"/>
+        <w:jc w:val="left"/>
+      </w:pPr>
+      <w:r>
+        <w:rPr>
+          <w:i w:val="1"/>
+          <w:iCs w:val="1"/>
+        </w:rPr>
+        <w:t xml:space="preserve">I had a thought, </w:t>
+      </w:r>
+      <w:r>
+        <w:rPr>
+          <w:b w:val="1"/>
+          <w:bCs w:val="1"/>
+          <w:i w:val="1"/>
+          <w:iCs w:val="1"/>
+          <w:color w:val="FF9900"/>
+        </w:rPr>
+        <w:t xml:space="preserve">[First Name]</w:t>
+      </w:r>
+      <w:r>
+        <w:rPr>
+          <w:i w:val="1"/>
+          <w:iCs w:val="1"/>
+        </w:rPr>
+        <w:t xml:space="preserve">. Real estate fraud reported to the FBI rose to $275 million last year, and fake emails about wire transfers before a closing are a common way in. How does your firm check those emails?</w:t>
+      </w:r>
+    </w:p>
+    <w:p>
+      <w:pPr>
+        <w:spacing w:before="240" w:after="0"/>
+      </w:pPr>
+      <w:r>
+        <w:rPr>
+          <w:b w:val="1"/>
+          <w:bCs w:val="1"/>
+          <w:i w:val="1"/>
+          <w:iCs w:val="1"/>
+          <w:color w:val="1F497D"/>
+        </w:rPr>
+        <w:t xml:space="preserve">IT track, AI version (to test)</w:t>
       </w:r>
     </w:p>
     <w:p>
@@ -825,7 +925,7 @@
           <w:i w:val="1"/>
           <w:iCs w:val="1"/>
         </w:rPr>
-        <w:t xml:space="preserve">, I jumped into questions without properly introducing myself. I'm Camila from Defenssive, a Chicago-area Microsoft Partner that focuses only on Microsoft 365 security. Our founder spent 8 years as a cybersecurity engineer, and our team holds five Microsoft security certifications. We built AI Security Manager. It connects to your Microsoft 365 and shows within minutes what's exposed and what to fix first, with a report you can use when a client asks. If interested, happy to tell you more.</w:t>
+        <w:t xml:space="preserve">, I jumped into questions without properly introducing myself. I'm Camila from Defenssive, a Chicago-area Microsoft Partner that focuses only on Microsoft security. Our founder spent 8 years as a cybersecurity engineer, and our team holds five Microsoft security certifications. We built AI Security Manager. It connects to your Microsoft 365 and shows within minutes what's exposed and what to fix first, with a report you can use when a client asks. If interested, happy to tell you more.</w:t>
       </w:r>
     </w:p>
     <w:p>
@@ -875,7 +975,7 @@
           <w:i w:val="1"/>
           <w:iCs w:val="1"/>
         </w:rPr>
-        <w:t xml:space="preserve">, I jumped into questions without properly introducing myself. I'm Camila from Defenssive, a Chicago-area Microsoft Partner that focuses only on Microsoft 365 security for smaller firms. Our founder spent 8 years as a cybersecurity engineer, and our team holds five Microsoft security certifications. We built AI Security Manager, which shows in plain language where your Microsoft 365 is exposed and what to fix first. If interested, happy to tell you more.</w:t>
+        <w:t xml:space="preserve">, I jumped into questions without properly introducing myself. I'm Camila from Defenssive, a Chicago-area Microsoft Partner that focuses only on Microsoft security for smaller firms. Our founder spent 8 years as a cybersecurity engineer, and our team holds five Microsoft security certifications. We built AI Security Manager, which shows in plain language where your Microsoft 365 is exposed and what to fix first. If interested, happy to tell you more.</w:t>
       </w:r>
     </w:p>
     <w:p>
@@ -1026,7 +1126,7 @@
           <w:i w:val="1"/>
           <w:iCs w:val="1"/>
         </w:rPr>
-        <w:t xml:space="preserve">, so I'll stop here. One last thing. We offer a free 30-day security check of your Microsoft 365, with no credit card. Whoever manages your Microsoft 365 can connect it, and results show up within minutes, and you'd get a plain-language report on where the firm stands. Want me to send the details so you can pass them on?</w:t>
+        <w:t xml:space="preserve">, so I'll stop here. One last thing. We offer a free 30-day security check of your Microsoft 365, with no credit card. Whoever manages your Microsoft 365 can set it up, results show up within minutes, and you'd get a plain-language report on where the firm stands. Want me to send the details so you can pass them on?</w:t>
       </w:r>
     </w:p>
     <w:p>
@@ -1136,7 +1236,7 @@
           <w:i w:val="1"/>
           <w:iCs w:val="1"/>
         </w:rPr>
-        <w:t xml:space="preserve">. Quick one. I've been talking to a few IT people at construction companies, and opinions seem split. Some say the biggest risk is out on the job sites, with all the devices and people coming and going. Others say it's the office email, where invoices and bank details go back and forth. Which worries you more?</w:t>
+        <w:t xml:space="preserve">. Quick one. I keep seeing two views among IT people at construction companies. Some say the biggest risk is out on the job sites, with all the devices and people coming and going. Others say it's the office email, where invoices and bank details go back and forth. Which worries you more?</w:t>
       </w:r>
     </w:p>
     <w:p>
@@ -1186,7 +1286,7 @@
           <w:i w:val="1"/>
           <w:iCs w:val="1"/>
         </w:rPr>
-        <w:t xml:space="preserve">. Curious what you think. Some construction owners I talk to say a company their size isn't really a target for hackers. Others say they're more of a target than ever, because so much money moves by email. Where do you land?</w:t>
+        <w:t xml:space="preserve">. Curious what you think. Some construction owners say a company their size isn't really a target for hackers. Others say they're more of a target than ever, because so much money moves by email. Where do you land?</w:t>
       </w:r>
     </w:p>
     <w:p>
@@ -1302,6 +1402,56 @@
           <w:iCs w:val="1"/>
           <w:color w:val="1F497D"/>
         </w:rPr>
+        <w:t xml:space="preserve">IT track, Microsoft MFA version (to test)</w:t>
+      </w:r>
+    </w:p>
+    <w:p>
+      <w:pPr>
+        <w:pBdr>
+          <w:top w:color="4f81bd" w:space="10" w:sz="4" w:val="single"/>
+          <w:bottom w:color="4f81bd" w:space="10" w:sz="4" w:val="single"/>
+        </w:pBdr>
+        <w:spacing w:after="240" w:before="240" w:line="240" w:lineRule="auto"/>
+        <w:ind w:left="720"/>
+        <w:jc w:val="left"/>
+      </w:pPr>
+      <w:r>
+        <w:rPr>
+          <w:i w:val="1"/>
+          <w:iCs w:val="1"/>
+        </w:rPr>
+        <w:t xml:space="preserve">I had a thought, </w:t>
+      </w:r>
+      <w:r>
+        <w:rPr>
+          <w:b w:val="1"/>
+          <w:bCs w:val="1"/>
+          <w:i w:val="1"/>
+          <w:iCs w:val="1"/>
+          <w:color w:val="FF9900"/>
+        </w:rPr>
+        <w:t xml:space="preserve">[First Name]</w:t>
+      </w:r>
+      <w:r>
+        <w:rPr>
+          <w:i w:val="1"/>
+          <w:iCs w:val="1"/>
+        </w:rPr>
+        <w:t xml:space="preserve">. Microsoft now requires MFA for admin access to Microsoft 365 and Azure, including PowerShell and scripts, and the last postponements ended in July. Has it affected your admin accounts or scripts?</w:t>
+      </w:r>
+    </w:p>
+    <w:p>
+      <w:pPr>
+        <w:spacing w:before="240" w:after="0"/>
+      </w:pPr>
+      <w:r>
+        <w:rPr>
+          <w:b w:val="1"/>
+          <w:bCs w:val="1"/>
+          <w:i w:val="1"/>
+          <w:iCs w:val="1"/>
+          <w:color w:val="1F497D"/>
+        </w:rPr>
         <w:t xml:space="preserve">Leadership track</w:t>
       </w:r>
     </w:p>
@@ -1437,7 +1587,7 @@
           <w:i w:val="1"/>
           <w:iCs w:val="1"/>
         </w:rPr>
-        <w:t xml:space="preserve">, I jumped into questions without properly introducing myself. I'm Camila from Defenssive, a Chicago-area Microsoft Partner that focuses only on Microsoft 365 security for smaller businesses. Our founder spent 8 years as a cybersecurity engineer, and our team holds five Microsoft security certifications. We built AI Security Manager, which checks the email and sign-in settings attackers use to take over a mailbox, and shows in plain language what to fix first. If interested, happy to tell you more.</w:t>
+        <w:t xml:space="preserve">, I jumped into questions without properly introducing myself. I'm Camila from Defenssive, a Chicago-area Microsoft Partner that focuses only on Microsoft security for smaller businesses. Our founder spent 8 years as a cybersecurity engineer, and our team holds five Microsoft security certifications. We built AI Security Manager, which checks the email and sign-in settings attackers use to take over a mailbox, and shows in plain language what to fix first. If interested, happy to tell you more.</w:t>
       </w:r>
     </w:p>
     <w:p>
@@ -1588,7 +1738,7 @@
           <w:i w:val="1"/>
           <w:iCs w:val="1"/>
         </w:rPr>
-        <w:t xml:space="preserve">, so I'll stop here. One last thing. We offer a free 30-day security check of your Microsoft 365, with no credit card. Whoever manages your Microsoft 365 can connect it, and results show up within minutes, and you'd get a plain-language report you can also use for your insurance renewal. Want me to send the details so you can pass them on?</w:t>
+        <w:t xml:space="preserve">, so I'll stop here. One last thing. We offer a free 30-day security check of your Microsoft 365, with no credit card. Whoever manages your Microsoft 365 can set it up, results show up within minutes, and you'd get a plain-language report you can also use for your insurance renewal. Want me to send the details so you can pass them on?</w:t>
       </w:r>
     </w:p>
     <w:p>
@@ -1698,7 +1848,7 @@
           <w:i w:val="1"/>
           <w:iCs w:val="1"/>
         </w:rPr>
-        <w:t xml:space="preserve">. Curious what you think. I've been talking to a few IT managers at manufacturers, and opinions seem split. Some say most of the risk is on the plant floor, in the machines and their networks. Others say attackers usually get in through office accounts and email first. Where do you land?</w:t>
+        <w:t xml:space="preserve">. Curious what you think. I keep seeing two views among IT managers at manufacturers. Some say most of the risk is on the plant floor, in the machines and their networks. Others say attackers usually get in through office accounts and email first. Where do you land?</w:t>
       </w:r>
     </w:p>
     <w:p>
@@ -1748,7 +1898,7 @@
           <w:i w:val="1"/>
           <w:iCs w:val="1"/>
         </w:rPr>
-        <w:t xml:space="preserve">. Quick question. Some manufacturers I talk to see cybersecurity mainly as an IT cost. Others see it as a production risk, because one attack can stop the line and delay deliveries. Where do you land?</w:t>
+        <w:t xml:space="preserve">. Quick question. Some manufacturers see cybersecurity mainly as an IT cost. Others see it as a production risk, because one attack can stop the line and delay deliveries. Where do you land?</w:t>
       </w:r>
     </w:p>
     <w:p>
@@ -2049,7 +2199,7 @@
           <w:i w:val="1"/>
           <w:iCs w:val="1"/>
         </w:rPr>
-        <w:t xml:space="preserve">, I jumped into questions without properly introducing myself. I'm Camila from Defenssive, a Chicago-area Microsoft Partner that focuses only on Microsoft 365 security for smaller businesses. Our founder spent 8 years as a cybersecurity engineer, and our team holds five Microsoft security certifications. We built AI Security Manager, which checks your Microsoft 365 access settings and shows in plain language what to fix first. Our engineers can then help fix it. If interested, happy to tell you more.</w:t>
+        <w:t xml:space="preserve">, I jumped into questions without properly introducing myself. I'm Camila from Defenssive, a Chicago-area Microsoft Partner that focuses only on Microsoft security for smaller businesses. Our founder spent 8 years as a cybersecurity engineer, and our team holds five Microsoft security certifications. We built AI Security Manager, which checks your Microsoft 365 access settings and shows in plain language what to fix first. Our engineers can then help fix it. If interested, happy to tell you more.</w:t>
       </w:r>
     </w:p>
     <w:p>
@@ -2200,7 +2350,7 @@
           <w:i w:val="1"/>
           <w:iCs w:val="1"/>
         </w:rPr>
-        <w:t xml:space="preserve">, so I'll stop here. One last thing. We offer a free 30-day security check of your Microsoft 365, with no credit card. Whoever manages your Microsoft 365 can connect it, and results show up within minutes, and you'd get a plain-language report on where you stand. Want me to send the details so you can pass them on?</w:t>
+        <w:t xml:space="preserve">, so I'll stop here. One last thing. We offer a free 30-day security check of your Microsoft 365, with no credit card. Whoever manages your Microsoft 365 can set it up, results show up within minutes, and you'd get a plain-language report on where you stand. Want me to send the details so you can pass them on?</w:t>
       </w:r>
     </w:p>
     <w:p>
@@ -2333,41 +2483,41 @@
           <w:i w:val="1"/>
           <w:iCs w:val="1"/>
         </w:rPr>
-        <w:t xml:space="preserve">I'm Camila from Defenssive, a Chicago-area Microsoft Partner that focuses only on Microsoft 365 security for smaller businesses.</w:t>
-      </w:r>
-    </w:p>
-    <w:p>
-      <w:pPr>
-        <w:pBdr>
-          <w:top w:color="4f81bd" w:space="10" w:sz="4" w:val="single"/>
-          <w:bottom w:color="4f81bd" w:space="10" w:sz="4" w:val="single"/>
-        </w:pBdr>
-        <w:spacing w:after="240" w:before="240" w:lineRule="auto"/>
-        <w:jc w:val="left"/>
-      </w:pPr>
-      <w:r>
-        <w:rPr>
-          <w:i w:val="1"/>
-          <w:iCs w:val="1"/>
-        </w:rPr>
-        <w:t xml:space="preserve">The reason I'm writing: more clients are asking law firms to show how they protect their data. At firms of 10 to 49 lawyers, 41% of lawyers say a client has already asked, and most of that data sits in Microsoft 365.</w:t>
-      </w:r>
-    </w:p>
-    <w:p>
-      <w:pPr>
-        <w:pBdr>
-          <w:top w:color="4f81bd" w:space="10" w:sz="4" w:val="single"/>
-          <w:bottom w:color="4f81bd" w:space="10" w:sz="4" w:val="single"/>
-        </w:pBdr>
-        <w:spacing w:after="240" w:before="240" w:lineRule="auto"/>
-        <w:jc w:val="left"/>
-      </w:pPr>
-      <w:r>
-        <w:rPr>
-          <w:i w:val="1"/>
-          <w:iCs w:val="1"/>
-        </w:rPr>
-        <w:t xml:space="preserve">AI Security Manager helps with that. It shows in a few minutes where your Microsoft 365 is exposed, and gives you a plain-language report you can share. It's free for 30 days, with no credit card.</w:t>
+        <w:t xml:space="preserve">I'm Camila from Defenssive, a Chicago-area Microsoft Partner that focuses only on Microsoft security for smaller businesses.</w:t>
+      </w:r>
+    </w:p>
+    <w:p>
+      <w:pPr>
+        <w:pBdr>
+          <w:top w:color="4f81bd" w:space="10" w:sz="4" w:val="single"/>
+          <w:bottom w:color="4f81bd" w:space="10" w:sz="4" w:val="single"/>
+        </w:pBdr>
+        <w:spacing w:after="240" w:before="240" w:lineRule="auto"/>
+        <w:jc w:val="left"/>
+      </w:pPr>
+      <w:r>
+        <w:rPr>
+          <w:i w:val="1"/>
+          <w:iCs w:val="1"/>
+        </w:rPr>
+        <w:t xml:space="preserve">The reason I'm writing: more clients are asking law firms to show how they protect their data. At firms of 10 to 49 lawyers, 41% of lawyers say a client has already asked.</w:t>
+      </w:r>
+    </w:p>
+    <w:p>
+      <w:pPr>
+        <w:pBdr>
+          <w:top w:color="4f81bd" w:space="10" w:sz="4" w:val="single"/>
+          <w:bottom w:color="4f81bd" w:space="10" w:sz="4" w:val="single"/>
+        </w:pBdr>
+        <w:spacing w:after="240" w:before="240" w:lineRule="auto"/>
+        <w:jc w:val="left"/>
+      </w:pPr>
+      <w:r>
+        <w:rPr>
+          <w:i w:val="1"/>
+          <w:iCs w:val="1"/>
+        </w:rPr>
+        <w:t xml:space="preserve">Our AI Security Manager shows in a few minutes where your Microsoft 365 is exposed, and gives you a plain-language report you can share when a client asks. It's free for 30 days, with no credit card.</w:t>
       </w:r>
     </w:p>
     <w:p>
@@ -2814,7 +2964,7 @@
           <w:i w:val="1"/>
           <w:iCs w:val="1"/>
         </w:rPr>
-        <w:t xml:space="preserve">I'm Camila from Defenssive, a Chicago-area Microsoft Partner that focuses only on Microsoft 365 security for smaller businesses.</w:t>
+        <w:t xml:space="preserve">I'm Camila from Defenssive, a Chicago-area Microsoft Partner that focuses only on Microsoft security for smaller businesses.</w:t>
       </w:r>
     </w:p>
     <w:p>
@@ -2977,7 +3127,7 @@
           <w:i w:val="1"/>
           <w:iCs w:val="1"/>
         </w:rPr>
-        <w:t xml:space="preserve">Following up. Cyber insurers now ask about MFA on email, remote access and admin accounts before they renew cover.</w:t>
+        <w:t xml:space="preserve">Following up. Cyber insurers such as Travelers now require MFA on email, remote access and admin accounts, and ask about it when you apply for cover.</w:t>
       </w:r>
     </w:p>
     <w:p>
@@ -3295,24 +3445,24 @@
           <w:i w:val="1"/>
           <w:iCs w:val="1"/>
         </w:rPr>
-        <w:t xml:space="preserve">I'm Camila from Defenssive, a Chicago-area Microsoft Partner that focuses only on Microsoft 365 security for smaller businesses.</w:t>
-      </w:r>
-    </w:p>
-    <w:p>
-      <w:pPr>
-        <w:pBdr>
-          <w:top w:color="4f81bd" w:space="10" w:sz="4" w:val="single"/>
-          <w:bottom w:color="4f81bd" w:space="10" w:sz="4" w:val="single"/>
-        </w:pBdr>
-        <w:spacing w:after="240" w:before="240" w:lineRule="auto"/>
-        <w:jc w:val="left"/>
-      </w:pPr>
-      <w:r>
-        <w:rPr>
-          <w:i w:val="1"/>
-          <w:iCs w:val="1"/>
-        </w:rPr>
-        <w:t xml:space="preserve">The reason I'm writing: manufacturing has been the most attacked industry for five years running, and badly set up access controls are the most common weakness IBM finds when it tests companies. For most companies, a lot of that access is managed in Microsoft 365.</w:t>
+        <w:t xml:space="preserve">I'm Camila from Defenssive, a Chicago-area Microsoft Partner that focuses only on Microsoft security for smaller businesses.</w:t>
+      </w:r>
+    </w:p>
+    <w:p>
+      <w:pPr>
+        <w:pBdr>
+          <w:top w:color="4f81bd" w:space="10" w:sz="4" w:val="single"/>
+          <w:bottom w:color="4f81bd" w:space="10" w:sz="4" w:val="single"/>
+        </w:pBdr>
+        <w:spacing w:after="240" w:before="240" w:lineRule="auto"/>
+        <w:jc w:val="left"/>
+      </w:pPr>
+      <w:r>
+        <w:rPr>
+          <w:i w:val="1"/>
+          <w:iCs w:val="1"/>
+        </w:rPr>
+        <w:t xml:space="preserve">The reason I'm writing: manufacturing has been the most attacked industry for five years running, and badly set up access controls are the most common weakness IBM finds when it tests companies. If you run Microsoft 365, a lot of that access is managed there.</w:t>
       </w:r>
     </w:p>
     <w:p>

</xml_diff>